<commit_message>
Revisa os 4 roteiros de vídeo com os ajustes de conteúdo e tom
Ajusta gancho/problema/solução dos roteiros de síndico e fornecedores
para tirar tom informal e repetições, adiciona CTA de sessão estratégica
onde fazia sentido, e padroniza "comente" no lugar de "comenta" em
todos os CTAs.
</commit_message>
<xml_diff>
--- a/eleva/roteiros-videos-tres-publicos/roteiro-1-sindico-formacao.docx
+++ b/eleva/roteiros-videos-tres-publicos/roteiro-1-sindico-formacao.docx
@@ -92,7 +92,7 @@
         <w:spacing w:after="100"/>
       </w:pPr>
       <w:r>
-        <w:t xml:space="preserve">Quem começa errado nesse mercado passa anos no erro e acerto, sem saber precificar, sem saber se posicionar — e acaba sendo só mais um nome na lista de orçamentos.</w:t>
+        <w:t xml:space="preserve">Quem começa no tentativa e erro nesse mercado, sem saber precificar e sem saber se posicionar, acaba sendo mais um número na lista de orçamentos — e facilmente substituível a cada assembleia.</w:t>
       </w:r>
     </w:p>
     <w:p>
@@ -116,7 +116,7 @@
         <w:spacing w:after="100"/>
       </w:pPr>
       <w:r>
-        <w:t xml:space="preserve">Existe um jeito de começar certo desde o primeiro momento: já entrando sabendo crescer e expandir sua carteira, cobrar honorários maiores, ganhar indicação e parar de concorrer por preço. Sendo valorizado pela sua entrega, como um síndico destaque.</w:t>
+        <w:t xml:space="preserve">Mas há um caminho: você já começa com metodologia, sabendo crescer e expandir sua carteira, já cobrando também honorários maiores desde o início. Com isso, você vai se destacar — vai se tornar um síndico destaque, que naturalmente ganha indicações e renova os contratos a cada assembleia. Porque agora você é visto como um síndico diferenciado, um parceiro de negócio que gera valor e não é substituível, porque é um profissional raro no mercado — um parceiro que gera patrimônio.</w:t>
       </w:r>
     </w:p>
     <w:p>
@@ -164,7 +164,7 @@
         <w:spacing w:after="100"/>
       </w:pPr>
       <w:r>
-        <w:t xml:space="preserve">Se você quer se tornar síndico e já começar pelo caminho certo, sem ficar no erro e acerto, temos o Curso de Formação de Síndico Profissional. Comenta 'FORMAÇÃO' aqui embaixo que te mando o link, ou acessa direto pelo link da bio.</w:t>
+        <w:t xml:space="preserve">Se você quer se tornar um síndico e, desde o início, já ser um síndico diferenciado, um síndico destaque, sem depender de erro e acerto, te convido a conhecer meu Curso de Formação de Síndico Profissional. Comente 'FORMAÇÃO' que eu te envio todos os detalhes no direct, ou se preferir, acessa o link da bio.</w:t>
       </w:r>
     </w:p>
     <w:p>
@@ -181,7 +181,7 @@
         <w:spacing w:after="150"/>
       </w:pPr>
       <w:r>
-        <w:t xml:space="preserve">Quer se tornar síndico profissional? O maior erro é começar cobrando barato e concorrendo por preço. 🏢</w:t>
+        <w:t xml:space="preserve">Quer se tornar síndico profissional? Cuidado pra não entrar cobrando barato e concorrendo só por preço. 🏢</w:t>
       </w:r>
     </w:p>
     <w:p>
@@ -189,7 +189,7 @@
         <w:spacing w:after="150"/>
       </w:pPr>
       <w:r>
-        <w:t xml:space="preserve">Dá pra começar certo desde o primeiro momento: crescendo carteira, cobrando honorários maiores, ganhando indicação e sendo valorizado como um síndico destaque — não mais um orçamento.</w:t>
+        <w:t xml:space="preserve">Quem começa no tentativa e erro acaba sendo mais um número na lista de orçamentos, fácil de substituir a cada assembleia. Mas há um caminho: começar com metodologia, cobrando honorários maiores desde o início e sendo visto como um síndico destaque — um parceiro de negócio que gera patrimônio.</w:t>
       </w:r>
     </w:p>
     <w:p>
@@ -205,7 +205,7 @@
         <w:spacing w:after="150"/>
       </w:pPr>
       <w:r>
-        <w:t xml:space="preserve">Comenta "FORMAÇÃO" que te mando o link, ou acessa direto pelo link da bio 👉 Curso de Formação de Síndico Profissional.</w:t>
+        <w:t xml:space="preserve">Comente "FORMAÇÃO" que te envio os detalhes no direct, ou acessa direto pelo link da bio 👉 Curso de Formação de Síndico Profissional.</w:t>
       </w:r>
     </w:p>
     <w:p>

</xml_diff>